<commit_message>
ajoute de gramatical truc pour ameliorer les perf du topic extracteur
</commit_message>
<xml_diff>
--- a/core/documents/testword.docx
+++ b/core/documents/testword.docx
@@ -1,48 +1,262 @@
 
 <file path=word/document.xml><?xml version="1.0" encoding="utf-8"?>
-<w:document xmlns:wpc="http://schemas.microsoft.com/office/word/2010/wordprocessingCanvas" xmlns:cx="http://schemas.microsoft.com/office/drawing/2014/chartex" xmlns:cx1="http://schemas.microsoft.com/office/drawing/2015/9/8/chartex" xmlns:cx2="http://schemas.microsoft.com/office/drawing/2015/10/21/chartex" xmlns:cx3="http://schemas.microsoft.com/office/drawing/2016/5/9/chartex" xmlns:cx4="http://schemas.microsoft.com/office/drawing/2016/5/10/chartex" xmlns:cx5="http://schemas.microsoft.com/office/drawing/2016/5/11/chartex" xmlns:cx6="http://schemas.microsoft.com/office/drawing/2016/5/12/chartex" xmlns:cx7="http://schemas.microsoft.com/office/drawing/2016/5/13/chartex" xmlns:cx8="http://schemas.microsoft.com/office/drawing/2016/5/14/chartex" xmlns:mc="http://schemas.openxmlformats.org/markup-compatibility/2006" xmlns:aink="http://schemas.microsoft.com/office/drawing/2016/ink" xmlns:am3d="http://schemas.microsoft.com/office/drawing/2017/model3d" xmlns:o="urn:schemas-microsoft-com:office:office" xmlns:oel="http://schemas.microsoft.com/office/2019/extlst" xmlns:r="http://schemas.openxmlformats.org/officeDocument/2006/relationships" xmlns:m="http://schemas.openxmlformats.org/officeDocument/2006/math" xmlns:v="urn:schemas-microsoft-com:vml" xmlns:wp14="http://schemas.microsoft.com/office/word/2010/wordprocessingDrawing" xmlns:wp="http://schemas.openxmlformats.org/drawingml/2006/wordprocessingDrawing" xmlns:w10="urn:schemas-microsoft-com:office:word" xmlns:w="http://schemas.openxmlformats.org/wordprocessingml/2006/main" xmlns:w14="http://schemas.microsoft.com/office/word/2010/wordml" xmlns:w15="http://schemas.microsoft.com/office/word/2012/wordml" xmlns:w16cex="http://schemas.microsoft.com/office/word/2018/wordml/cex" xmlns:w16cid="http://schemas.microsoft.com/office/word/2016/wordml/cid" xmlns:w16="http://schemas.microsoft.com/office/word/2018/wordml" xmlns:w16du="http://schemas.microsoft.com/office/word/2023/wordml/word16du" xmlns:w16sdtdh="http://schemas.microsoft.com/office/word/2020/wordml/sdtdatahash" xmlns:w16sdtfl="http://schemas.microsoft.com/office/word/2024/wordml/sdtformatlock" xmlns:w16se="http://schemas.microsoft.com/office/word/2015/wordml/symex" xmlns:wpg="http://schemas.microsoft.com/office/word/2010/wordprocessingGroup" xmlns:wpi="http://schemas.microsoft.com/office/word/2010/wordprocessingInk" xmlns:wne="http://schemas.microsoft.com/office/word/2006/wordml" xmlns:wps="http://schemas.microsoft.com/office/word/2010/wordprocessingShape" mc:Ignorable="w14 w15 w16se w16cid w16 w16cex w16sdtdh w16sdtfl w16du wp14">
+<w:document xmlns:o="urn:schemas-microsoft-com:office:office" xmlns:r="http://schemas.openxmlformats.org/officeDocument/2006/relationships" xmlns:v="urn:schemas-microsoft-com:vml" xmlns:w="http://schemas.openxmlformats.org/wordprocessingml/2006/main" xmlns:w10="urn:schemas-microsoft-com:office:word" xmlns:wp="http://schemas.openxmlformats.org/drawingml/2006/wordprocessingDrawing" xmlns:wps="http://schemas.microsoft.com/office/word/2010/wordprocessingShape" xmlns:wpg="http://schemas.microsoft.com/office/word/2010/wordprocessingGroup" xmlns:mc="http://schemas.openxmlformats.org/markup-compatibility/2006" xmlns:wp14="http://schemas.microsoft.com/office/word/2010/wordprocessingDrawing" xmlns:w14="http://schemas.microsoft.com/office/word/2010/wordml" xmlns:w15="http://schemas.microsoft.com/office/word/2012/wordml" mc:Ignorable="w14 wp14 w15">
   <w:body>
     <w:p>
+      <w:pPr>
+        <w:pStyle w:val="TextBody"/>
+        <w:rPr/>
+      </w:pPr>
       <w:r>
         <w:rPr>
           <w:b/>
           <w:bCs/>
         </w:rPr>
-        <w:t xml:space="preserve">Équipée d'un moteur V10 de 620 chevaux, l'Audi R8 passe de 0 à 100 km/h en moins de 3,5 secondes, affirmant ainsi sa place de </w:t>
-      </w:r>
-      <w:proofErr w:type="spellStart"/>
+        <w:t xml:space="preserve">La </w:t>
+      </w:r>
+      <w:r>
+        <w:rPr>
+          <w:rStyle w:val="StrongEmphasis"/>
+        </w:rPr>
+        <w:t>Audi R8</w:t>
+      </w:r>
       <w:r>
         <w:rPr>
           <w:b/>
           <w:bCs/>
         </w:rPr>
-        <w:t>supercar</w:t>
-      </w:r>
-      <w:proofErr w:type="spellEnd"/>
+        <w:t xml:space="preserve"> est l’un des modèles les plus emblématiques produits par le constructeur allemand </w:t>
+      </w:r>
+      <w:r>
+        <w:rPr>
+          <w:rStyle w:val="StrongEmphasis"/>
+        </w:rPr>
+        <w:t>Audi</w:t>
+      </w:r>
       <w:r>
         <w:rPr>
           <w:b/>
           <w:bCs/>
         </w:rPr>
-        <w:t xml:space="preserve"> emblématique de la marque aux anneaux. </w:t>
+        <w:t xml:space="preserve">. Lancée pour la première fois en 2006, cette voiture de sport représente la vitrine technologique de la marque et symbolise la capacité d’Audi à combiner performance, innovation et design. Inspirée directement de l’expérience d’Audi dans les compétitions d’endurance, notamment aux </w:t>
+      </w:r>
+      <w:r>
+        <w:rPr>
+          <w:rStyle w:val="StrongEmphasis"/>
+        </w:rPr>
+        <w:t>24 Heures du Mans</w:t>
+      </w:r>
+      <w:r>
+        <w:rPr>
+          <w:b/>
+          <w:bCs/>
+        </w:rPr>
+        <w:t>, la R8 a été conçue pour apporter sur la route des technologies issues du sport automobile.</w:t>
+      </w:r>
+    </w:p>
+    <w:p>
+      <w:pPr>
+        <w:pStyle w:val="TextBody"/>
+        <w:rPr/>
+      </w:pPr>
+      <w:r>
+        <w:rPr/>
+        <w:t xml:space="preserve">L’un des éléments les plus marquants de l’Audi R8 est son architecture mécanique. Contrairement à de nombreuses voitures traditionnelles, son moteur est placé en position </w:t>
+      </w:r>
+      <w:r>
+        <w:rPr>
+          <w:rStyle w:val="StrongEmphasis"/>
+        </w:rPr>
+        <w:t>centrale arrière</w:t>
+      </w:r>
+      <w:r>
+        <w:rPr/>
+        <w:t xml:space="preserve">, ce qui permet une meilleure répartition du poids et améliore la stabilité dans les virages. La plupart des versions sont équipées d’un moteur </w:t>
+      </w:r>
+      <w:r>
+        <w:rPr>
+          <w:rStyle w:val="StrongEmphasis"/>
+        </w:rPr>
+        <w:t>V10 atmosphérique</w:t>
+      </w:r>
+      <w:r>
+        <w:rPr/>
+        <w:t xml:space="preserve">, dérivé de celui utilisé dans la </w:t>
+      </w:r>
+      <w:r>
+        <w:rPr>
+          <w:rStyle w:val="StrongEmphasis"/>
+        </w:rPr>
+        <w:t>Lamborghini Huracán</w:t>
+      </w:r>
+      <w:r>
+        <w:rPr/>
+        <w:t xml:space="preserve">, ce qui montre la proximité technologique entre Audi et </w:t>
+      </w:r>
+      <w:r>
+        <w:rPr>
+          <w:rStyle w:val="StrongEmphasis"/>
+        </w:rPr>
+        <w:t>Lamborghini</w:t>
+      </w:r>
+      <w:r>
+        <w:rPr/>
+        <w:t xml:space="preserve">, deux marques appartenant au groupe </w:t>
+      </w:r>
+      <w:r>
+        <w:rPr>
+          <w:rStyle w:val="StrongEmphasis"/>
+        </w:rPr>
+        <w:t>Volkswagen Group</w:t>
+      </w:r>
+      <w:r>
+        <w:rPr/>
+        <w:t>. Ce moteur peut développer plus de 600 chevaux dans les versions les plus performantes, permettant à la voiture d’atteindre une vitesse maximale dépassant les 330 km/h et d’accélérer de 0 à 100 km/h en environ trois secondes.</w:t>
+      </w:r>
+    </w:p>
+    <w:p>
+      <w:pPr>
+        <w:pStyle w:val="TextBody"/>
+        <w:rPr/>
+      </w:pPr>
+      <w:r>
+        <w:rPr/>
+        <w:t xml:space="preserve">Le design de la R8 est également un aspect central de son identité. Dès sa première génération, la voiture se distingue par des lignes très marquées et une silhouette basse et large. L’un des éléments visuels les plus reconnaissables est la </w:t>
+      </w:r>
+      <w:r>
+        <w:rPr>
+          <w:rStyle w:val="StrongEmphasis"/>
+        </w:rPr>
+        <w:t>“side blade”</w:t>
+      </w:r>
+      <w:r>
+        <w:rPr/>
+        <w:t>, une grande lame située derrière les portes qui sert à la fois d’élément esthétique et fonctionnel pour la gestion de l’air. Les designers d’Audi ont cherché à créer une voiture à la fois sportive et élégante, fidèle au style épuré et technologique caractéristique de la marque.</w:t>
+      </w:r>
+    </w:p>
+    <w:p>
+      <w:pPr>
+        <w:pStyle w:val="TextBody"/>
+        <w:rPr/>
+      </w:pPr>
+      <w:r>
+        <w:rPr/>
+        <w:t xml:space="preserve">L’intérieur de l’Audi R8 reflète également la philosophie d’Audi en matière de qualité et de technologie. L’habitacle est orienté vers le conducteur et utilise des matériaux haut de gamme comme l’aluminium, le cuir et la fibre de carbone. L’interface numérique appelée </w:t>
+      </w:r>
+      <w:r>
+        <w:rPr>
+          <w:rStyle w:val="StrongEmphasis"/>
+        </w:rPr>
+        <w:t>Audi Virtual Cockpit</w:t>
+      </w:r>
+      <w:r>
+        <w:rPr/>
+        <w:t xml:space="preserve"> remplace les compteurs traditionnels par un écran entièrement configurable, permettant au conducteur de visualiser les informations de conduite, la navigation ou les données de performance.</w:t>
+      </w:r>
+    </w:p>
+    <w:p>
+      <w:pPr>
+        <w:pStyle w:val="TextBody"/>
+        <w:rPr/>
+      </w:pPr>
+      <w:r>
+        <w:rPr/>
+        <w:t xml:space="preserve">Au niveau technologique, la R8 utilise le système de transmission intégrale </w:t>
+      </w:r>
+      <w:r>
+        <w:rPr>
+          <w:rStyle w:val="StrongEmphasis"/>
+        </w:rPr>
+        <w:t>quattro</w:t>
+      </w:r>
+      <w:r>
+        <w:rPr/>
+        <w:t>, une technologie emblématique d’Audi. Ce système permet de répartir la puissance entre les roues avant et arrière afin d’améliorer l’adhérence, particulièrement dans les conditions difficiles ou lors de conduites sportives. Cette technologie contribue à rendre la R8 plus stable et plus accessible à conduire que beaucoup d’autres supercars, tout en conservant un niveau de performance très élevé.</w:t>
+      </w:r>
+    </w:p>
+    <w:p>
+      <w:pPr>
+        <w:pStyle w:val="TextBody"/>
+        <w:rPr/>
+      </w:pPr>
+      <w:r>
+        <w:rPr/>
+        <w:t>Au fil des années, plusieurs versions de la R8 ont été produites. La première génération proposait déjà différentes motorisations, notamment un moteur V8 et un moteur V10. La seconde génération, lancée en 2015, a introduit un châssis plus léger, davantage d’électronique embarquée et des performances encore supérieures. Des versions spéciales comme la R8 Performance ou la R8 GT ont été développées pour offrir des caractéristiques encore plus radicales, souvent en série limitée.</w:t>
+      </w:r>
+    </w:p>
+    <w:p>
+      <w:pPr>
+        <w:pStyle w:val="TextBody"/>
+        <w:rPr/>
+      </w:pPr>
+      <w:r>
+        <w:rPr/>
+        <w:t xml:space="preserve">La R8 possède également une importance culturelle. Elle est devenue très populaire dans les films et les jeux vidéo, ce qui a contribué à renforcer son image de supercar moderne. Par exemple, le personnage de </w:t>
+      </w:r>
+      <w:r>
+        <w:rPr>
+          <w:rStyle w:val="StrongEmphasis"/>
+        </w:rPr>
+        <w:t>Tony Stark</w:t>
+      </w:r>
+      <w:r>
+        <w:rPr/>
+        <w:t xml:space="preserve"> dans le film </w:t>
+      </w:r>
+      <w:r>
+        <w:rPr>
+          <w:rStyle w:val="StrongEmphasis"/>
+        </w:rPr>
+        <w:t>Iron Man</w:t>
+      </w:r>
+      <w:r>
+        <w:rPr/>
+        <w:t xml:space="preserve"> conduit une Audi R8, ce qui a fortement participé à la visibilité du modèle auprès du grand public.</w:t>
+      </w:r>
+    </w:p>
+    <w:p>
+      <w:pPr>
+        <w:pStyle w:val="TextBody"/>
+        <w:rPr/>
+      </w:pPr>
+      <w:r>
+        <w:rPr/>
+        <w:t>Enfin, la production de la R8 marque une étape importante dans l’histoire d’Audi, car elle représente la première véritable supercar développée par la marque. Elle montre comment un constructeur traditionnellement connu pour ses berlines et ses voitures familiales a réussi à s’imposer dans un segment dominé par des marques italiennes prestigieuses. Même après l’arrêt progressif du modèle dans les années 2020, l’Audi R8 reste une voiture très respectée dans le monde automobile et demeure un symbole de performance, d’ingénierie avancée et de passion pour la conduite.</w:t>
+      </w:r>
+    </w:p>
+    <w:p>
+      <w:pPr>
+        <w:pStyle w:val="Normal"/>
+        <w:spacing w:before="0" w:after="160"/>
+        <w:rPr>
+          <w:b/>
+          <w:b/>
+          <w:bCs/>
+        </w:rPr>
+      </w:pPr>
+      <w:r>
+        <w:rPr/>
       </w:r>
     </w:p>
     <w:sectPr>
+      <w:type w:val="nextPage"/>
       <w:pgSz w:w="11906" w:h="16838"/>
-      <w:pgMar w:top="1417" w:right="1417" w:bottom="1417" w:left="1417" w:header="708" w:footer="708" w:gutter="0"/>
-      <w:cols w:space="708"/>
-      <w:docGrid w:linePitch="360"/>
+      <w:pgMar w:left="1417" w:right="1417" w:gutter="0" w:header="0" w:top="1417" w:footer="0" w:bottom="1417"/>
+      <w:pgNumType w:fmt="decimal"/>
+      <w:formProt w:val="false"/>
+      <w:textDirection w:val="lrTb"/>
+      <w:docGrid w:type="default" w:linePitch="360" w:charSpace="4096"/>
     </w:sectPr>
   </w:body>
 </w:document>
 </file>
 
 <file path=word/styles.xml><?xml version="1.0" encoding="utf-8"?>
-<w:styles xmlns:mc="http://schemas.openxmlformats.org/markup-compatibility/2006" xmlns:r="http://schemas.openxmlformats.org/officeDocument/2006/relationships" xmlns:w="http://schemas.openxmlformats.org/wordprocessingml/2006/main" xmlns:w14="http://schemas.microsoft.com/office/word/2010/wordml" xmlns:w15="http://schemas.microsoft.com/office/word/2012/wordml" xmlns:w16cex="http://schemas.microsoft.com/office/word/2018/wordml/cex" xmlns:w16cid="http://schemas.microsoft.com/office/word/2016/wordml/cid" xmlns:w16="http://schemas.microsoft.com/office/word/2018/wordml" xmlns:w16du="http://schemas.microsoft.com/office/word/2023/wordml/word16du" xmlns:w16sdtdh="http://schemas.microsoft.com/office/word/2020/wordml/sdtdatahash" xmlns:w16sdtfl="http://schemas.microsoft.com/office/word/2024/wordml/sdtformatlock" xmlns:w16se="http://schemas.microsoft.com/office/word/2015/wordml/symex" mc:Ignorable="w14 w15 w16se w16cid w16 w16cex w16sdtdh w16sdtfl w16du">
+<w:styles xmlns:w="http://schemas.openxmlformats.org/wordprocessingml/2006/main" xmlns:w14="http://schemas.microsoft.com/office/word/2010/wordml" xmlns:mc="http://schemas.openxmlformats.org/markup-compatibility/2006" mc:Ignorable="w14">
   <w:docDefaults>
     <w:rPrDefault>
       <w:rPr>
-        <w:rFonts w:asciiTheme="minorHAnsi" w:eastAsiaTheme="minorHAnsi" w:hAnsiTheme="minorHAnsi" w:cstheme="minorBidi"/>
+        <w:rFonts w:ascii="Aptos" w:hAnsi="Aptos" w:eastAsia="Aptos" w:cs="Arial" w:asciiTheme="minorHAnsi" w:cstheme="minorBidi" w:eastAsiaTheme="minorHAnsi" w:hAnsiTheme="minorHAnsi"/>
         <w:kern w:val="2"/>
         <w:sz w:val="22"/>
         <w:szCs w:val="22"/>
@@ -52,21 +266,21 @@
     </w:rPrDefault>
     <w:pPrDefault>
       <w:pPr>
-        <w:spacing w:after="160" w:line="259" w:lineRule="auto"/>
+        <w:suppressAutoHyphens w:val="true"/>
       </w:pPr>
     </w:pPrDefault>
   </w:docDefaults>
   <w:latentStyles w:defLockedState="0" w:defUIPriority="99" w:defSemiHidden="0" w:defUnhideWhenUsed="0" w:defQFormat="0" w:count="376">
     <w:lsdException w:name="Normal" w:uiPriority="0" w:qFormat="1"/>
     <w:lsdException w:name="heading 1" w:uiPriority="9" w:qFormat="1"/>
-    <w:lsdException w:name="heading 2" w:semiHidden="1" w:uiPriority="9" w:unhideWhenUsed="1" w:qFormat="1"/>
-    <w:lsdException w:name="heading 3" w:semiHidden="1" w:uiPriority="9" w:unhideWhenUsed="1" w:qFormat="1"/>
-    <w:lsdException w:name="heading 4" w:semiHidden="1" w:uiPriority="9" w:unhideWhenUsed="1" w:qFormat="1"/>
-    <w:lsdException w:name="heading 5" w:semiHidden="1" w:uiPriority="9" w:unhideWhenUsed="1" w:qFormat="1"/>
-    <w:lsdException w:name="heading 6" w:semiHidden="1" w:uiPriority="9" w:unhideWhenUsed="1" w:qFormat="1"/>
-    <w:lsdException w:name="heading 7" w:semiHidden="1" w:uiPriority="9" w:unhideWhenUsed="1" w:qFormat="1"/>
-    <w:lsdException w:name="heading 8" w:semiHidden="1" w:uiPriority="9" w:unhideWhenUsed="1" w:qFormat="1"/>
-    <w:lsdException w:name="heading 9" w:semiHidden="1" w:uiPriority="9" w:unhideWhenUsed="1" w:qFormat="1"/>
+    <w:lsdException w:name="heading 2" w:uiPriority="9" w:semiHidden="1" w:unhideWhenUsed="1" w:qFormat="1"/>
+    <w:lsdException w:name="heading 3" w:uiPriority="9" w:semiHidden="1" w:unhideWhenUsed="1" w:qFormat="1"/>
+    <w:lsdException w:name="heading 4" w:uiPriority="9" w:semiHidden="1" w:unhideWhenUsed="1" w:qFormat="1"/>
+    <w:lsdException w:name="heading 5" w:uiPriority="9" w:semiHidden="1" w:unhideWhenUsed="1" w:qFormat="1"/>
+    <w:lsdException w:name="heading 6" w:uiPriority="9" w:semiHidden="1" w:unhideWhenUsed="1" w:qFormat="1"/>
+    <w:lsdException w:name="heading 7" w:uiPriority="9" w:semiHidden="1" w:unhideWhenUsed="1" w:qFormat="1"/>
+    <w:lsdException w:name="heading 8" w:uiPriority="9" w:semiHidden="1" w:unhideWhenUsed="1" w:qFormat="1"/>
+    <w:lsdException w:name="heading 9" w:uiPriority="9" w:semiHidden="1" w:unhideWhenUsed="1" w:qFormat="1"/>
     <w:lsdException w:name="index 1" w:semiHidden="1" w:unhideWhenUsed="1"/>
     <w:lsdException w:name="index 2" w:semiHidden="1" w:unhideWhenUsed="1"/>
     <w:lsdException w:name="index 3" w:semiHidden="1" w:unhideWhenUsed="1"/>
@@ -76,22 +290,22 @@
     <w:lsdException w:name="index 7" w:semiHidden="1" w:unhideWhenUsed="1"/>
     <w:lsdException w:name="index 8" w:semiHidden="1" w:unhideWhenUsed="1"/>
     <w:lsdException w:name="index 9" w:semiHidden="1" w:unhideWhenUsed="1"/>
-    <w:lsdException w:name="toc 1" w:semiHidden="1" w:uiPriority="39" w:unhideWhenUsed="1"/>
-    <w:lsdException w:name="toc 2" w:semiHidden="1" w:uiPriority="39" w:unhideWhenUsed="1"/>
-    <w:lsdException w:name="toc 3" w:semiHidden="1" w:uiPriority="39" w:unhideWhenUsed="1"/>
-    <w:lsdException w:name="toc 4" w:semiHidden="1" w:uiPriority="39" w:unhideWhenUsed="1"/>
-    <w:lsdException w:name="toc 5" w:semiHidden="1" w:uiPriority="39" w:unhideWhenUsed="1"/>
-    <w:lsdException w:name="toc 6" w:semiHidden="1" w:uiPriority="39" w:unhideWhenUsed="1"/>
-    <w:lsdException w:name="toc 7" w:semiHidden="1" w:uiPriority="39" w:unhideWhenUsed="1"/>
-    <w:lsdException w:name="toc 8" w:semiHidden="1" w:uiPriority="39" w:unhideWhenUsed="1"/>
-    <w:lsdException w:name="toc 9" w:semiHidden="1" w:uiPriority="39" w:unhideWhenUsed="1"/>
+    <w:lsdException w:name="toc 1" w:uiPriority="39" w:semiHidden="1" w:unhideWhenUsed="1"/>
+    <w:lsdException w:name="toc 2" w:uiPriority="39" w:semiHidden="1" w:unhideWhenUsed="1"/>
+    <w:lsdException w:name="toc 3" w:uiPriority="39" w:semiHidden="1" w:unhideWhenUsed="1"/>
+    <w:lsdException w:name="toc 4" w:uiPriority="39" w:semiHidden="1" w:unhideWhenUsed="1"/>
+    <w:lsdException w:name="toc 5" w:uiPriority="39" w:semiHidden="1" w:unhideWhenUsed="1"/>
+    <w:lsdException w:name="toc 6" w:uiPriority="39" w:semiHidden="1" w:unhideWhenUsed="1"/>
+    <w:lsdException w:name="toc 7" w:uiPriority="39" w:semiHidden="1" w:unhideWhenUsed="1"/>
+    <w:lsdException w:name="toc 8" w:uiPriority="39" w:semiHidden="1" w:unhideWhenUsed="1"/>
+    <w:lsdException w:name="toc 9" w:uiPriority="39" w:semiHidden="1" w:unhideWhenUsed="1"/>
     <w:lsdException w:name="Normal Indent" w:semiHidden="1" w:unhideWhenUsed="1"/>
     <w:lsdException w:name="footnote text" w:semiHidden="1" w:unhideWhenUsed="1"/>
     <w:lsdException w:name="annotation text" w:semiHidden="1" w:unhideWhenUsed="1"/>
     <w:lsdException w:name="header" w:semiHidden="1" w:unhideWhenUsed="1"/>
     <w:lsdException w:name="footer" w:semiHidden="1" w:unhideWhenUsed="1"/>
     <w:lsdException w:name="index heading" w:semiHidden="1" w:unhideWhenUsed="1"/>
-    <w:lsdException w:name="caption" w:semiHidden="1" w:uiPriority="35" w:unhideWhenUsed="1" w:qFormat="1"/>
+    <w:lsdException w:name="caption" w:uiPriority="35" w:semiHidden="1" w:unhideWhenUsed="1" w:qFormat="1"/>
     <w:lsdException w:name="table of figures" w:semiHidden="1" w:unhideWhenUsed="1"/>
     <w:lsdException w:name="envelope address" w:semiHidden="1" w:unhideWhenUsed="1"/>
     <w:lsdException w:name="envelope return" w:semiHidden="1" w:unhideWhenUsed="1"/>
@@ -122,7 +336,7 @@
     <w:lsdException w:name="Title" w:uiPriority="10" w:qFormat="1"/>
     <w:lsdException w:name="Closing" w:semiHidden="1" w:unhideWhenUsed="1"/>
     <w:lsdException w:name="Signature" w:semiHidden="1" w:unhideWhenUsed="1"/>
-    <w:lsdException w:name="Default Paragraph Font" w:semiHidden="1" w:uiPriority="1" w:unhideWhenUsed="1"/>
+    <w:lsdException w:name="Default Paragraph Font" w:uiPriority="1" w:semiHidden="1" w:unhideWhenUsed="1"/>
     <w:lsdException w:name="Body Text" w:semiHidden="1" w:unhideWhenUsed="1"/>
     <w:lsdException w:name="Body Text Indent" w:semiHidden="1" w:unhideWhenUsed="1"/>
     <w:lsdException w:name="List Continue" w:semiHidden="1" w:unhideWhenUsed="1"/>
@@ -322,8 +536,8 @@
     <w:lsdException w:name="Subtle Reference" w:uiPriority="31" w:qFormat="1"/>
     <w:lsdException w:name="Intense Reference" w:uiPriority="32" w:qFormat="1"/>
     <w:lsdException w:name="Book Title" w:uiPriority="33" w:qFormat="1"/>
-    <w:lsdException w:name="Bibliography" w:semiHidden="1" w:uiPriority="37" w:unhideWhenUsed="1"/>
-    <w:lsdException w:name="TOC Heading" w:semiHidden="1" w:uiPriority="39" w:unhideWhenUsed="1" w:qFormat="1"/>
+    <w:lsdException w:name="Bibliography" w:uiPriority="37" w:semiHidden="1" w:unhideWhenUsed="1"/>
+    <w:lsdException w:name="TOC Heading" w:uiPriority="39" w:semiHidden="1" w:unhideWhenUsed="1" w:qFormat="1"/>
     <w:lsdException w:name="Plain Table 1" w:uiPriority="41"/>
     <w:lsdException w:name="Plain Table 2" w:uiPriority="42"/>
     <w:lsdException w:name="Plain Table 3" w:uiPriority="43"/>
@@ -434,33 +648,48 @@
     <w:lsdException w:name="Unresolved Mention" w:semiHidden="1" w:unhideWhenUsed="1"/>
     <w:lsdException w:name="Smart Link" w:semiHidden="1" w:unhideWhenUsed="1"/>
   </w:latentStyles>
-  <w:style w:type="paragraph" w:default="1" w:styleId="Normal">
+  <w:style w:type="paragraph" w:styleId="Normal" w:default="1">
     <w:name w:val="Normal"/>
     <w:qFormat/>
+    <w:pPr>
+      <w:widowControl/>
+      <w:bidi w:val="0"/>
+      <w:spacing w:lineRule="auto" w:line="259" w:before="0" w:after="160"/>
+      <w:jc w:val="left"/>
+    </w:pPr>
+    <w:rPr>
+      <w:rFonts w:ascii="Aptos" w:hAnsi="Aptos" w:eastAsia="Aptos" w:cs="Arial" w:asciiTheme="minorHAnsi" w:cstheme="minorBidi" w:eastAsiaTheme="minorHAnsi" w:hAnsiTheme="minorHAnsi"/>
+      <w:color w:val="auto"/>
+      <w:kern w:val="2"/>
+      <w:sz w:val="22"/>
+      <w:szCs w:val="22"/>
+      <w:lang w:val="fr-FR" w:eastAsia="en-US" w:bidi="ar-SA"/>
+      <w14:ligatures w14:val="standardContextual"/>
+    </w:rPr>
   </w:style>
   <w:style w:type="paragraph" w:styleId="Heading1">
-    <w:name w:val="heading 1"/>
+    <w:name w:val="Heading 1"/>
     <w:basedOn w:val="Normal"/>
     <w:next w:val="Normal"/>
     <w:link w:val="Heading1Char"/>
     <w:uiPriority w:val="9"/>
     <w:qFormat/>
-    <w:rsid w:val="007F1CAC"/>
-    <w:pPr>
-      <w:keepNext/>
+    <w:rsid w:val="007f1cac"/>
+    <w:pPr>
+      <w:keepNext w:val="true"/>
       <w:keepLines/>
       <w:spacing w:before="360" w:after="80"/>
       <w:outlineLvl w:val="0"/>
     </w:pPr>
     <w:rPr>
-      <w:rFonts w:asciiTheme="majorHAnsi" w:eastAsiaTheme="majorEastAsia" w:hAnsiTheme="majorHAnsi" w:cstheme="majorBidi"/>
-      <w:color w:val="0F4761" w:themeColor="accent1" w:themeShade="BF"/>
+      <w:rFonts w:ascii="Aptos Display" w:hAnsi="Aptos Display" w:eastAsia="" w:cs="Times New Roman" w:asciiTheme="majorHAnsi" w:cstheme="majorBidi" w:eastAsiaTheme="majorEastAsia" w:hAnsiTheme="majorHAnsi"/>
+      <w:color w:val="0F4761" w:themeColor="accent1" w:themeShade="bf"/>
       <w:sz w:val="40"/>
       <w:szCs w:val="40"/>
     </w:rPr>
   </w:style>
   <w:style w:type="paragraph" w:styleId="Heading2">
-    <w:name w:val="heading 2"/>
+    <w:name w:val="Heading 2"/>
     <w:basedOn w:val="Normal"/>
     <w:next w:val="Normal"/>
     <w:link w:val="Heading2Char"/>
@@ -468,22 +697,22 @@
     <w:semiHidden/>
     <w:unhideWhenUsed/>
     <w:qFormat/>
-    <w:rsid w:val="007F1CAC"/>
-    <w:pPr>
-      <w:keepNext/>
+    <w:rsid w:val="007f1cac"/>
+    <w:pPr>
+      <w:keepNext w:val="true"/>
       <w:keepLines/>
       <w:spacing w:before="160" w:after="80"/>
       <w:outlineLvl w:val="1"/>
     </w:pPr>
     <w:rPr>
-      <w:rFonts w:asciiTheme="majorHAnsi" w:eastAsiaTheme="majorEastAsia" w:hAnsiTheme="majorHAnsi" w:cstheme="majorBidi"/>
-      <w:color w:val="0F4761" w:themeColor="accent1" w:themeShade="BF"/>
+      <w:rFonts w:ascii="Aptos Display" w:hAnsi="Aptos Display" w:eastAsia="" w:cs="Times New Roman" w:asciiTheme="majorHAnsi" w:cstheme="majorBidi" w:eastAsiaTheme="majorEastAsia" w:hAnsiTheme="majorHAnsi"/>
+      <w:color w:val="0F4761" w:themeColor="accent1" w:themeShade="bf"/>
       <w:sz w:val="32"/>
       <w:szCs w:val="32"/>
     </w:rPr>
   </w:style>
   <w:style w:type="paragraph" w:styleId="Heading3">
-    <w:name w:val="heading 3"/>
+    <w:name w:val="Heading 3"/>
     <w:basedOn w:val="Normal"/>
     <w:next w:val="Normal"/>
     <w:link w:val="Heading3Char"/>
@@ -491,22 +720,22 @@
     <w:semiHidden/>
     <w:unhideWhenUsed/>
     <w:qFormat/>
-    <w:rsid w:val="007F1CAC"/>
-    <w:pPr>
-      <w:keepNext/>
+    <w:rsid w:val="007f1cac"/>
+    <w:pPr>
+      <w:keepNext w:val="true"/>
       <w:keepLines/>
       <w:spacing w:before="160" w:after="80"/>
       <w:outlineLvl w:val="2"/>
     </w:pPr>
     <w:rPr>
-      <w:rFonts w:eastAsiaTheme="majorEastAsia" w:cstheme="majorBidi"/>
-      <w:color w:val="0F4761" w:themeColor="accent1" w:themeShade="BF"/>
+      <w:rFonts w:eastAsia="" w:cs="Times New Roman" w:cstheme="majorBidi" w:eastAsiaTheme="majorEastAsia"/>
+      <w:color w:val="0F4761" w:themeColor="accent1" w:themeShade="bf"/>
       <w:sz w:val="28"/>
       <w:szCs w:val="28"/>
     </w:rPr>
   </w:style>
   <w:style w:type="paragraph" w:styleId="Heading4">
-    <w:name w:val="heading 4"/>
+    <w:name w:val="Heading 4"/>
     <w:basedOn w:val="Normal"/>
     <w:next w:val="Normal"/>
     <w:link w:val="Heading4Char"/>
@@ -514,22 +743,22 @@
     <w:semiHidden/>
     <w:unhideWhenUsed/>
     <w:qFormat/>
-    <w:rsid w:val="007F1CAC"/>
-    <w:pPr>
-      <w:keepNext/>
+    <w:rsid w:val="007f1cac"/>
+    <w:pPr>
+      <w:keepNext w:val="true"/>
       <w:keepLines/>
       <w:spacing w:before="80" w:after="40"/>
       <w:outlineLvl w:val="3"/>
     </w:pPr>
     <w:rPr>
-      <w:rFonts w:eastAsiaTheme="majorEastAsia" w:cstheme="majorBidi"/>
+      <w:rFonts w:eastAsia="" w:cs="Times New Roman" w:cstheme="majorBidi" w:eastAsiaTheme="majorEastAsia"/>
       <w:i/>
       <w:iCs/>
-      <w:color w:val="0F4761" w:themeColor="accent1" w:themeShade="BF"/>
+      <w:color w:val="0F4761" w:themeColor="accent1" w:themeShade="bf"/>
     </w:rPr>
   </w:style>
   <w:style w:type="paragraph" w:styleId="Heading5">
-    <w:name w:val="heading 5"/>
+    <w:name w:val="Heading 5"/>
     <w:basedOn w:val="Normal"/>
     <w:next w:val="Normal"/>
     <w:link w:val="Heading5Char"/>
@@ -537,20 +766,20 @@
     <w:semiHidden/>
     <w:unhideWhenUsed/>
     <w:qFormat/>
-    <w:rsid w:val="007F1CAC"/>
-    <w:pPr>
-      <w:keepNext/>
+    <w:rsid w:val="007f1cac"/>
+    <w:pPr>
+      <w:keepNext w:val="true"/>
       <w:keepLines/>
       <w:spacing w:before="80" w:after="40"/>
       <w:outlineLvl w:val="4"/>
     </w:pPr>
     <w:rPr>
-      <w:rFonts w:eastAsiaTheme="majorEastAsia" w:cstheme="majorBidi"/>
-      <w:color w:val="0F4761" w:themeColor="accent1" w:themeShade="BF"/>
+      <w:rFonts w:eastAsia="" w:cs="Times New Roman" w:cstheme="majorBidi" w:eastAsiaTheme="majorEastAsia"/>
+      <w:color w:val="0F4761" w:themeColor="accent1" w:themeShade="bf"/>
     </w:rPr>
   </w:style>
   <w:style w:type="paragraph" w:styleId="Heading6">
-    <w:name w:val="heading 6"/>
+    <w:name w:val="Heading 6"/>
     <w:basedOn w:val="Normal"/>
     <w:next w:val="Normal"/>
     <w:link w:val="Heading6Char"/>
@@ -558,22 +787,22 @@
     <w:semiHidden/>
     <w:unhideWhenUsed/>
     <w:qFormat/>
-    <w:rsid w:val="007F1CAC"/>
-    <w:pPr>
-      <w:keepNext/>
+    <w:rsid w:val="007f1cac"/>
+    <w:pPr>
+      <w:keepNext w:val="true"/>
       <w:keepLines/>
       <w:spacing w:before="40" w:after="0"/>
       <w:outlineLvl w:val="5"/>
     </w:pPr>
     <w:rPr>
-      <w:rFonts w:eastAsiaTheme="majorEastAsia" w:cstheme="majorBidi"/>
+      <w:rFonts w:eastAsia="" w:cs="Times New Roman" w:cstheme="majorBidi" w:eastAsiaTheme="majorEastAsia"/>
       <w:i/>
       <w:iCs/>
-      <w:color w:val="595959" w:themeColor="text1" w:themeTint="A6"/>
+      <w:color w:val="595959" w:themeColor="text1" w:themeTint="a6"/>
     </w:rPr>
   </w:style>
   <w:style w:type="paragraph" w:styleId="Heading7">
-    <w:name w:val="heading 7"/>
+    <w:name w:val="Heading 7"/>
     <w:basedOn w:val="Normal"/>
     <w:next w:val="Normal"/>
     <w:link w:val="Heading7Char"/>
@@ -581,20 +810,20 @@
     <w:semiHidden/>
     <w:unhideWhenUsed/>
     <w:qFormat/>
-    <w:rsid w:val="007F1CAC"/>
-    <w:pPr>
-      <w:keepNext/>
+    <w:rsid w:val="007f1cac"/>
+    <w:pPr>
+      <w:keepNext w:val="true"/>
       <w:keepLines/>
       <w:spacing w:before="40" w:after="0"/>
       <w:outlineLvl w:val="6"/>
     </w:pPr>
     <w:rPr>
-      <w:rFonts w:eastAsiaTheme="majorEastAsia" w:cstheme="majorBidi"/>
-      <w:color w:val="595959" w:themeColor="text1" w:themeTint="A6"/>
+      <w:rFonts w:eastAsia="" w:cs="Times New Roman" w:cstheme="majorBidi" w:eastAsiaTheme="majorEastAsia"/>
+      <w:color w:val="595959" w:themeColor="text1" w:themeTint="a6"/>
     </w:rPr>
   </w:style>
   <w:style w:type="paragraph" w:styleId="Heading8">
-    <w:name w:val="heading 8"/>
+    <w:name w:val="Heading 8"/>
     <w:basedOn w:val="Normal"/>
     <w:next w:val="Normal"/>
     <w:link w:val="Heading8Char"/>
@@ -602,22 +831,22 @@
     <w:semiHidden/>
     <w:unhideWhenUsed/>
     <w:qFormat/>
-    <w:rsid w:val="007F1CAC"/>
-    <w:pPr>
-      <w:keepNext/>
+    <w:rsid w:val="007f1cac"/>
+    <w:pPr>
+      <w:keepNext w:val="true"/>
       <w:keepLines/>
-      <w:spacing w:after="0"/>
+      <w:spacing w:before="0" w:after="0"/>
       <w:outlineLvl w:val="7"/>
     </w:pPr>
     <w:rPr>
-      <w:rFonts w:eastAsiaTheme="majorEastAsia" w:cstheme="majorBidi"/>
+      <w:rFonts w:eastAsia="" w:cs="Times New Roman" w:cstheme="majorBidi" w:eastAsiaTheme="majorEastAsia"/>
       <w:i/>
       <w:iCs/>
-      <w:color w:val="272727" w:themeColor="text1" w:themeTint="D8"/>
+      <w:color w:val="272727" w:themeColor="text1" w:themeTint="d8"/>
     </w:rPr>
   </w:style>
   <w:style w:type="paragraph" w:styleId="Heading9">
-    <w:name w:val="heading 9"/>
+    <w:name w:val="Heading 9"/>
     <w:basedOn w:val="Normal"/>
     <w:next w:val="Normal"/>
     <w:link w:val="Heading9Char"/>
@@ -625,22 +854,398 @@
     <w:semiHidden/>
     <w:unhideWhenUsed/>
     <w:qFormat/>
-    <w:rsid w:val="007F1CAC"/>
-    <w:pPr>
-      <w:keepNext/>
+    <w:rsid w:val="007f1cac"/>
+    <w:pPr>
+      <w:keepNext w:val="true"/>
       <w:keepLines/>
-      <w:spacing w:after="0"/>
+      <w:spacing w:before="0" w:after="0"/>
       <w:outlineLvl w:val="8"/>
     </w:pPr>
     <w:rPr>
-      <w:rFonts w:eastAsiaTheme="majorEastAsia" w:cstheme="majorBidi"/>
-      <w:color w:val="272727" w:themeColor="text1" w:themeTint="D8"/>
-    </w:rPr>
-  </w:style>
-  <w:style w:type="character" w:default="1" w:styleId="DefaultParagraphFont">
+      <w:rFonts w:eastAsia="" w:cs="Times New Roman" w:cstheme="majorBidi" w:eastAsiaTheme="majorEastAsia"/>
+      <w:color w:val="272727" w:themeColor="text1" w:themeTint="d8"/>
+    </w:rPr>
+  </w:style>
+  <w:style w:type="character" w:styleId="DefaultParagraphFont" w:default="1">
     <w:name w:val="Default Paragraph Font"/>
     <w:uiPriority w:val="1"/>
     <w:unhideWhenUsed/>
+    <w:qFormat/>
+    <w:rPr/>
+  </w:style>
+  <w:style w:type="character" w:styleId="Heading1Char" w:customStyle="1">
+    <w:name w:val="Heading 1 Char"/>
+    <w:basedOn w:val="DefaultParagraphFont"/>
+    <w:link w:val="Heading1"/>
+    <w:uiPriority w:val="9"/>
+    <w:qFormat/>
+    <w:rsid w:val="007f1cac"/>
+    <w:rPr>
+      <w:rFonts w:ascii="Aptos Display" w:hAnsi="Aptos Display" w:eastAsia="" w:cs="Times New Roman" w:asciiTheme="majorHAnsi" w:cstheme="majorBidi" w:eastAsiaTheme="majorEastAsia" w:hAnsiTheme="majorHAnsi"/>
+      <w:color w:val="0F4761" w:themeColor="accent1" w:themeShade="bf"/>
+      <w:sz w:val="40"/>
+      <w:szCs w:val="40"/>
+    </w:rPr>
+  </w:style>
+  <w:style w:type="character" w:styleId="Heading2Char" w:customStyle="1">
+    <w:name w:val="Heading 2 Char"/>
+    <w:basedOn w:val="DefaultParagraphFont"/>
+    <w:link w:val="Heading2"/>
+    <w:uiPriority w:val="9"/>
+    <w:semiHidden/>
+    <w:qFormat/>
+    <w:rsid w:val="007f1cac"/>
+    <w:rPr>
+      <w:rFonts w:ascii="Aptos Display" w:hAnsi="Aptos Display" w:eastAsia="" w:cs="Times New Roman" w:asciiTheme="majorHAnsi" w:cstheme="majorBidi" w:eastAsiaTheme="majorEastAsia" w:hAnsiTheme="majorHAnsi"/>
+      <w:color w:val="0F4761" w:themeColor="accent1" w:themeShade="bf"/>
+      <w:sz w:val="32"/>
+      <w:szCs w:val="32"/>
+    </w:rPr>
+  </w:style>
+  <w:style w:type="character" w:styleId="Heading3Char" w:customStyle="1">
+    <w:name w:val="Heading 3 Char"/>
+    <w:basedOn w:val="DefaultParagraphFont"/>
+    <w:link w:val="Heading3"/>
+    <w:uiPriority w:val="9"/>
+    <w:semiHidden/>
+    <w:qFormat/>
+    <w:rsid w:val="007f1cac"/>
+    <w:rPr>
+      <w:rFonts w:eastAsia="" w:cs="Times New Roman" w:cstheme="majorBidi" w:eastAsiaTheme="majorEastAsia"/>
+      <w:color w:val="0F4761" w:themeColor="accent1" w:themeShade="bf"/>
+      <w:sz w:val="28"/>
+      <w:szCs w:val="28"/>
+    </w:rPr>
+  </w:style>
+  <w:style w:type="character" w:styleId="Heading4Char" w:customStyle="1">
+    <w:name w:val="Heading 4 Char"/>
+    <w:basedOn w:val="DefaultParagraphFont"/>
+    <w:link w:val="Heading4"/>
+    <w:uiPriority w:val="9"/>
+    <w:semiHidden/>
+    <w:qFormat/>
+    <w:rsid w:val="007f1cac"/>
+    <w:rPr>
+      <w:rFonts w:eastAsia="" w:cs="Times New Roman" w:cstheme="majorBidi" w:eastAsiaTheme="majorEastAsia"/>
+      <w:i/>
+      <w:iCs/>
+      <w:color w:val="0F4761" w:themeColor="accent1" w:themeShade="bf"/>
+    </w:rPr>
+  </w:style>
+  <w:style w:type="character" w:styleId="Heading5Char" w:customStyle="1">
+    <w:name w:val="Heading 5 Char"/>
+    <w:basedOn w:val="DefaultParagraphFont"/>
+    <w:link w:val="Heading5"/>
+    <w:uiPriority w:val="9"/>
+    <w:semiHidden/>
+    <w:qFormat/>
+    <w:rsid w:val="007f1cac"/>
+    <w:rPr>
+      <w:rFonts w:eastAsia="" w:cs="Times New Roman" w:cstheme="majorBidi" w:eastAsiaTheme="majorEastAsia"/>
+      <w:color w:val="0F4761" w:themeColor="accent1" w:themeShade="bf"/>
+    </w:rPr>
+  </w:style>
+  <w:style w:type="character" w:styleId="Heading6Char" w:customStyle="1">
+    <w:name w:val="Heading 6 Char"/>
+    <w:basedOn w:val="DefaultParagraphFont"/>
+    <w:link w:val="Heading6"/>
+    <w:uiPriority w:val="9"/>
+    <w:semiHidden/>
+    <w:qFormat/>
+    <w:rsid w:val="007f1cac"/>
+    <w:rPr>
+      <w:rFonts w:eastAsia="" w:cs="Times New Roman" w:cstheme="majorBidi" w:eastAsiaTheme="majorEastAsia"/>
+      <w:i/>
+      <w:iCs/>
+      <w:color w:val="595959" w:themeColor="text1" w:themeTint="a6"/>
+    </w:rPr>
+  </w:style>
+  <w:style w:type="character" w:styleId="Heading7Char" w:customStyle="1">
+    <w:name w:val="Heading 7 Char"/>
+    <w:basedOn w:val="DefaultParagraphFont"/>
+    <w:link w:val="Heading7"/>
+    <w:uiPriority w:val="9"/>
+    <w:semiHidden/>
+    <w:qFormat/>
+    <w:rsid w:val="007f1cac"/>
+    <w:rPr>
+      <w:rFonts w:eastAsia="" w:cs="Times New Roman" w:cstheme="majorBidi" w:eastAsiaTheme="majorEastAsia"/>
+      <w:color w:val="595959" w:themeColor="text1" w:themeTint="a6"/>
+    </w:rPr>
+  </w:style>
+  <w:style w:type="character" w:styleId="Heading8Char" w:customStyle="1">
+    <w:name w:val="Heading 8 Char"/>
+    <w:basedOn w:val="DefaultParagraphFont"/>
+    <w:link w:val="Heading8"/>
+    <w:uiPriority w:val="9"/>
+    <w:semiHidden/>
+    <w:qFormat/>
+    <w:rsid w:val="007f1cac"/>
+    <w:rPr>
+      <w:rFonts w:eastAsia="" w:cs="Times New Roman" w:cstheme="majorBidi" w:eastAsiaTheme="majorEastAsia"/>
+      <w:i/>
+      <w:iCs/>
+      <w:color w:val="272727" w:themeColor="text1" w:themeTint="d8"/>
+    </w:rPr>
+  </w:style>
+  <w:style w:type="character" w:styleId="Heading9Char" w:customStyle="1">
+    <w:name w:val="Heading 9 Char"/>
+    <w:basedOn w:val="DefaultParagraphFont"/>
+    <w:link w:val="Heading9"/>
+    <w:uiPriority w:val="9"/>
+    <w:semiHidden/>
+    <w:qFormat/>
+    <w:rsid w:val="007f1cac"/>
+    <w:rPr>
+      <w:rFonts w:eastAsia="" w:cs="Times New Roman" w:cstheme="majorBidi" w:eastAsiaTheme="majorEastAsia"/>
+      <w:color w:val="272727" w:themeColor="text1" w:themeTint="d8"/>
+    </w:rPr>
+  </w:style>
+  <w:style w:type="character" w:styleId="TitleChar" w:customStyle="1">
+    <w:name w:val="Title Char"/>
+    <w:basedOn w:val="DefaultParagraphFont"/>
+    <w:link w:val="Title"/>
+    <w:uiPriority w:val="10"/>
+    <w:qFormat/>
+    <w:rsid w:val="007f1cac"/>
+    <w:rPr>
+      <w:rFonts w:ascii="Aptos Display" w:hAnsi="Aptos Display" w:eastAsia="" w:cs="Times New Roman" w:asciiTheme="majorHAnsi" w:cstheme="majorBidi" w:eastAsiaTheme="majorEastAsia" w:hAnsiTheme="majorHAnsi"/>
+      <w:spacing w:val="-10"/>
+      <w:kern w:val="2"/>
+      <w:sz w:val="56"/>
+      <w:szCs w:val="56"/>
+    </w:rPr>
+  </w:style>
+  <w:style w:type="character" w:styleId="SubtitleChar" w:customStyle="1">
+    <w:name w:val="Subtitle Char"/>
+    <w:basedOn w:val="DefaultParagraphFont"/>
+    <w:link w:val="Subtitle"/>
+    <w:uiPriority w:val="11"/>
+    <w:qFormat/>
+    <w:rsid w:val="007f1cac"/>
+    <w:rPr>
+      <w:rFonts w:eastAsia="" w:cs="Times New Roman" w:cstheme="majorBidi" w:eastAsiaTheme="majorEastAsia"/>
+      <w:color w:val="595959" w:themeColor="text1" w:themeTint="a6"/>
+      <w:spacing w:val="15"/>
+      <w:sz w:val="28"/>
+      <w:szCs w:val="28"/>
+    </w:rPr>
+  </w:style>
+  <w:style w:type="character" w:styleId="QuoteChar" w:customStyle="1">
+    <w:name w:val="Quote Char"/>
+    <w:basedOn w:val="DefaultParagraphFont"/>
+    <w:link w:val="Quote"/>
+    <w:uiPriority w:val="29"/>
+    <w:qFormat/>
+    <w:rsid w:val="007f1cac"/>
+    <w:rPr>
+      <w:i/>
+      <w:iCs/>
+      <w:color w:val="404040" w:themeColor="text1" w:themeTint="bf"/>
+    </w:rPr>
+  </w:style>
+  <w:style w:type="character" w:styleId="IntenseEmphasis">
+    <w:name w:val="Intense Emphasis"/>
+    <w:basedOn w:val="DefaultParagraphFont"/>
+    <w:uiPriority w:val="21"/>
+    <w:qFormat/>
+    <w:rsid w:val="007f1cac"/>
+    <w:rPr>
+      <w:i/>
+      <w:iCs/>
+      <w:color w:val="0F4761" w:themeColor="accent1" w:themeShade="bf"/>
+    </w:rPr>
+  </w:style>
+  <w:style w:type="character" w:styleId="IntenseQuoteChar" w:customStyle="1">
+    <w:name w:val="Intense Quote Char"/>
+    <w:basedOn w:val="DefaultParagraphFont"/>
+    <w:link w:val="IntenseQuote"/>
+    <w:uiPriority w:val="30"/>
+    <w:qFormat/>
+    <w:rsid w:val="007f1cac"/>
+    <w:rPr>
+      <w:i/>
+      <w:iCs/>
+      <w:color w:val="0F4761" w:themeColor="accent1" w:themeShade="bf"/>
+    </w:rPr>
+  </w:style>
+  <w:style w:type="character" w:styleId="IntenseReference">
+    <w:name w:val="Intense Reference"/>
+    <w:basedOn w:val="DefaultParagraphFont"/>
+    <w:uiPriority w:val="32"/>
+    <w:qFormat/>
+    <w:rsid w:val="007f1cac"/>
+    <w:rPr>
+      <w:b/>
+      <w:bCs/>
+      <w:smallCaps/>
+      <w:color w:val="0F4761" w:themeColor="accent1" w:themeShade="bf"/>
+      <w:spacing w:val="5"/>
+    </w:rPr>
+  </w:style>
+  <w:style w:type="character" w:styleId="StrongEmphasis">
+    <w:name w:val="Strong Emphasis"/>
+    <w:qFormat/>
+    <w:rPr>
+      <w:b/>
+      <w:bCs/>
+    </w:rPr>
+  </w:style>
+  <w:style w:type="paragraph" w:styleId="Heading">
+    <w:name w:val="Heading"/>
+    <w:basedOn w:val="Normal"/>
+    <w:next w:val="TextBody"/>
+    <w:qFormat/>
+    <w:pPr>
+      <w:keepNext w:val="true"/>
+      <w:spacing w:before="240" w:after="120"/>
+    </w:pPr>
+    <w:rPr>
+      <w:rFonts w:ascii="Liberation Sans" w:hAnsi="Liberation Sans" w:eastAsia="Noto Sans CJK SC" w:cs="Lohit Devanagari"/>
+      <w:sz w:val="28"/>
+      <w:szCs w:val="28"/>
+    </w:rPr>
+  </w:style>
+  <w:style w:type="paragraph" w:styleId="TextBody">
+    <w:name w:val="Body Text"/>
+    <w:basedOn w:val="Normal"/>
+    <w:pPr>
+      <w:spacing w:lineRule="auto" w:line="276" w:before="0" w:after="140"/>
+    </w:pPr>
+    <w:rPr/>
+  </w:style>
+  <w:style w:type="paragraph" w:styleId="List">
+    <w:name w:val="List"/>
+    <w:basedOn w:val="TextBody"/>
+    <w:pPr/>
+    <w:rPr>
+      <w:rFonts w:cs="Lohit Devanagari"/>
+    </w:rPr>
+  </w:style>
+  <w:style w:type="paragraph" w:styleId="Caption">
+    <w:name w:val="Caption"/>
+    <w:basedOn w:val="Normal"/>
+    <w:qFormat/>
+    <w:pPr>
+      <w:suppressLineNumbers/>
+      <w:spacing w:before="120" w:after="120"/>
+    </w:pPr>
+    <w:rPr>
+      <w:rFonts w:cs="Lohit Devanagari"/>
+      <w:i/>
+      <w:iCs/>
+      <w:sz w:val="24"/>
+      <w:szCs w:val="24"/>
+    </w:rPr>
+  </w:style>
+  <w:style w:type="paragraph" w:styleId="Index">
+    <w:name w:val="Index"/>
+    <w:basedOn w:val="Normal"/>
+    <w:qFormat/>
+    <w:pPr>
+      <w:suppressLineNumbers/>
+    </w:pPr>
+    <w:rPr>
+      <w:rFonts w:cs="Lohit Devanagari"/>
+    </w:rPr>
+  </w:style>
+  <w:style w:type="paragraph" w:styleId="Title">
+    <w:name w:val="Title"/>
+    <w:basedOn w:val="Normal"/>
+    <w:next w:val="Normal"/>
+    <w:link w:val="TitleChar"/>
+    <w:uiPriority w:val="10"/>
+    <w:qFormat/>
+    <w:rsid w:val="007f1cac"/>
+    <w:pPr>
+      <w:spacing w:lineRule="auto" w:line="240" w:before="0" w:after="80"/>
+      <w:contextualSpacing/>
+    </w:pPr>
+    <w:rPr>
+      <w:rFonts w:ascii="Aptos Display" w:hAnsi="Aptos Display" w:eastAsia="" w:cs="Times New Roman" w:asciiTheme="majorHAnsi" w:cstheme="majorBidi" w:eastAsiaTheme="majorEastAsia" w:hAnsiTheme="majorHAnsi"/>
+      <w:spacing w:val="-10"/>
+      <w:kern w:val="2"/>
+      <w:sz w:val="56"/>
+      <w:szCs w:val="56"/>
+    </w:rPr>
+  </w:style>
+  <w:style w:type="paragraph" w:styleId="Subtitle">
+    <w:name w:val="Subtitle"/>
+    <w:basedOn w:val="Normal"/>
+    <w:next w:val="Normal"/>
+    <w:link w:val="SubtitleChar"/>
+    <w:uiPriority w:val="11"/>
+    <w:qFormat/>
+    <w:rsid w:val="007f1cac"/>
+    <w:pPr/>
+    <w:rPr>
+      <w:rFonts w:eastAsia="" w:cs="Times New Roman" w:cstheme="majorBidi" w:eastAsiaTheme="majorEastAsia"/>
+      <w:color w:val="595959" w:themeColor="text1" w:themeTint="a6"/>
+      <w:spacing w:val="15"/>
+      <w:sz w:val="28"/>
+      <w:szCs w:val="28"/>
+    </w:rPr>
+  </w:style>
+  <w:style w:type="paragraph" w:styleId="Quote">
+    <w:name w:val="Quote"/>
+    <w:basedOn w:val="Normal"/>
+    <w:next w:val="Normal"/>
+    <w:link w:val="QuoteChar"/>
+    <w:uiPriority w:val="29"/>
+    <w:qFormat/>
+    <w:rsid w:val="007f1cac"/>
+    <w:pPr>
+      <w:spacing w:before="160" w:after="160"/>
+      <w:jc w:val="center"/>
+    </w:pPr>
+    <w:rPr>
+      <w:i/>
+      <w:iCs/>
+      <w:color w:val="404040" w:themeColor="text1" w:themeTint="bf"/>
+    </w:rPr>
+  </w:style>
+  <w:style w:type="paragraph" w:styleId="ListParagraph">
+    <w:name w:val="List Paragraph"/>
+    <w:basedOn w:val="Normal"/>
+    <w:uiPriority w:val="34"/>
+    <w:qFormat/>
+    <w:rsid w:val="007f1cac"/>
+    <w:pPr>
+      <w:spacing w:before="0" w:after="160"/>
+      <w:ind w:left="720" w:hanging="0"/>
+      <w:contextualSpacing/>
+    </w:pPr>
+    <w:rPr/>
+  </w:style>
+  <w:style w:type="paragraph" w:styleId="IntenseQuote">
+    <w:name w:val="Intense Quote"/>
+    <w:basedOn w:val="Normal"/>
+    <w:next w:val="Normal"/>
+    <w:link w:val="IntenseQuoteChar"/>
+    <w:uiPriority w:val="30"/>
+    <w:qFormat/>
+    <w:rsid w:val="007f1cac"/>
+    <w:pPr>
+      <w:pBdr>
+        <w:top w:val="single" w:sz="4" w:space="10" w:color="0F4761"/>
+        <w:bottom w:val="single" w:sz="4" w:space="10" w:color="0F4761"/>
+      </w:pBdr>
+      <w:spacing w:before="360" w:after="360"/>
+      <w:ind w:left="864" w:right="864" w:hanging="0"/>
+      <w:jc w:val="center"/>
+    </w:pPr>
+    <w:rPr>
+      <w:i/>
+      <w:iCs/>
+      <w:color w:val="0F4761" w:themeColor="accent1" w:themeShade="bf"/>
+    </w:rPr>
+  </w:style>
+  <w:style w:type="numbering" w:styleId="NoList" w:default="1">
+    <w:name w:val="No List"/>
+    <w:uiPriority w:val="99"/>
+    <w:semiHidden/>
+    <w:unhideWhenUsed/>
+    <w:qFormat/>
   </w:style>
   <w:style w:type="table" w:default="1" w:styleId="TableNormal">
     <w:name w:val="Normal Table"/>
@@ -648,7 +1253,6 @@
     <w:semiHidden/>
     <w:unhideWhenUsed/>
     <w:tblPr>
-      <w:tblInd w:w="0" w:type="dxa"/>
       <w:tblCellMar>
         <w:top w:w="0" w:type="dxa"/>
         <w:left w:w="108" w:type="dxa"/>
@@ -656,302 +1260,6 @@
         <w:right w:w="108" w:type="dxa"/>
       </w:tblCellMar>
     </w:tblPr>
-  </w:style>
-  <w:style w:type="numbering" w:default="1" w:styleId="NoList">
-    <w:name w:val="No List"/>
-    <w:uiPriority w:val="99"/>
-    <w:semiHidden/>
-    <w:unhideWhenUsed/>
-  </w:style>
-  <w:style w:type="character" w:customStyle="1" w:styleId="Heading1Char">
-    <w:name w:val="Heading 1 Char"/>
-    <w:basedOn w:val="DefaultParagraphFont"/>
-    <w:link w:val="Heading1"/>
-    <w:uiPriority w:val="9"/>
-    <w:rsid w:val="007F1CAC"/>
-    <w:rPr>
-      <w:rFonts w:asciiTheme="majorHAnsi" w:eastAsiaTheme="majorEastAsia" w:hAnsiTheme="majorHAnsi" w:cstheme="majorBidi"/>
-      <w:color w:val="0F4761" w:themeColor="accent1" w:themeShade="BF"/>
-      <w:sz w:val="40"/>
-      <w:szCs w:val="40"/>
-    </w:rPr>
-  </w:style>
-  <w:style w:type="character" w:customStyle="1" w:styleId="Heading2Char">
-    <w:name w:val="Heading 2 Char"/>
-    <w:basedOn w:val="DefaultParagraphFont"/>
-    <w:link w:val="Heading2"/>
-    <w:uiPriority w:val="9"/>
-    <w:semiHidden/>
-    <w:rsid w:val="007F1CAC"/>
-    <w:rPr>
-      <w:rFonts w:asciiTheme="majorHAnsi" w:eastAsiaTheme="majorEastAsia" w:hAnsiTheme="majorHAnsi" w:cstheme="majorBidi"/>
-      <w:color w:val="0F4761" w:themeColor="accent1" w:themeShade="BF"/>
-      <w:sz w:val="32"/>
-      <w:szCs w:val="32"/>
-    </w:rPr>
-  </w:style>
-  <w:style w:type="character" w:customStyle="1" w:styleId="Heading3Char">
-    <w:name w:val="Heading 3 Char"/>
-    <w:basedOn w:val="DefaultParagraphFont"/>
-    <w:link w:val="Heading3"/>
-    <w:uiPriority w:val="9"/>
-    <w:semiHidden/>
-    <w:rsid w:val="007F1CAC"/>
-    <w:rPr>
-      <w:rFonts w:eastAsiaTheme="majorEastAsia" w:cstheme="majorBidi"/>
-      <w:color w:val="0F4761" w:themeColor="accent1" w:themeShade="BF"/>
-      <w:sz w:val="28"/>
-      <w:szCs w:val="28"/>
-    </w:rPr>
-  </w:style>
-  <w:style w:type="character" w:customStyle="1" w:styleId="Heading4Char">
-    <w:name w:val="Heading 4 Char"/>
-    <w:basedOn w:val="DefaultParagraphFont"/>
-    <w:link w:val="Heading4"/>
-    <w:uiPriority w:val="9"/>
-    <w:semiHidden/>
-    <w:rsid w:val="007F1CAC"/>
-    <w:rPr>
-      <w:rFonts w:eastAsiaTheme="majorEastAsia" w:cstheme="majorBidi"/>
-      <w:i/>
-      <w:iCs/>
-      <w:color w:val="0F4761" w:themeColor="accent1" w:themeShade="BF"/>
-    </w:rPr>
-  </w:style>
-  <w:style w:type="character" w:customStyle="1" w:styleId="Heading5Char">
-    <w:name w:val="Heading 5 Char"/>
-    <w:basedOn w:val="DefaultParagraphFont"/>
-    <w:link w:val="Heading5"/>
-    <w:uiPriority w:val="9"/>
-    <w:semiHidden/>
-    <w:rsid w:val="007F1CAC"/>
-    <w:rPr>
-      <w:rFonts w:eastAsiaTheme="majorEastAsia" w:cstheme="majorBidi"/>
-      <w:color w:val="0F4761" w:themeColor="accent1" w:themeShade="BF"/>
-    </w:rPr>
-  </w:style>
-  <w:style w:type="character" w:customStyle="1" w:styleId="Heading6Char">
-    <w:name w:val="Heading 6 Char"/>
-    <w:basedOn w:val="DefaultParagraphFont"/>
-    <w:link w:val="Heading6"/>
-    <w:uiPriority w:val="9"/>
-    <w:semiHidden/>
-    <w:rsid w:val="007F1CAC"/>
-    <w:rPr>
-      <w:rFonts w:eastAsiaTheme="majorEastAsia" w:cstheme="majorBidi"/>
-      <w:i/>
-      <w:iCs/>
-      <w:color w:val="595959" w:themeColor="text1" w:themeTint="A6"/>
-    </w:rPr>
-  </w:style>
-  <w:style w:type="character" w:customStyle="1" w:styleId="Heading7Char">
-    <w:name w:val="Heading 7 Char"/>
-    <w:basedOn w:val="DefaultParagraphFont"/>
-    <w:link w:val="Heading7"/>
-    <w:uiPriority w:val="9"/>
-    <w:semiHidden/>
-    <w:rsid w:val="007F1CAC"/>
-    <w:rPr>
-      <w:rFonts w:eastAsiaTheme="majorEastAsia" w:cstheme="majorBidi"/>
-      <w:color w:val="595959" w:themeColor="text1" w:themeTint="A6"/>
-    </w:rPr>
-  </w:style>
-  <w:style w:type="character" w:customStyle="1" w:styleId="Heading8Char">
-    <w:name w:val="Heading 8 Char"/>
-    <w:basedOn w:val="DefaultParagraphFont"/>
-    <w:link w:val="Heading8"/>
-    <w:uiPriority w:val="9"/>
-    <w:semiHidden/>
-    <w:rsid w:val="007F1CAC"/>
-    <w:rPr>
-      <w:rFonts w:eastAsiaTheme="majorEastAsia" w:cstheme="majorBidi"/>
-      <w:i/>
-      <w:iCs/>
-      <w:color w:val="272727" w:themeColor="text1" w:themeTint="D8"/>
-    </w:rPr>
-  </w:style>
-  <w:style w:type="character" w:customStyle="1" w:styleId="Heading9Char">
-    <w:name w:val="Heading 9 Char"/>
-    <w:basedOn w:val="DefaultParagraphFont"/>
-    <w:link w:val="Heading9"/>
-    <w:uiPriority w:val="9"/>
-    <w:semiHidden/>
-    <w:rsid w:val="007F1CAC"/>
-    <w:rPr>
-      <w:rFonts w:eastAsiaTheme="majorEastAsia" w:cstheme="majorBidi"/>
-      <w:color w:val="272727" w:themeColor="text1" w:themeTint="D8"/>
-    </w:rPr>
-  </w:style>
-  <w:style w:type="paragraph" w:styleId="Title">
-    <w:name w:val="Title"/>
-    <w:basedOn w:val="Normal"/>
-    <w:next w:val="Normal"/>
-    <w:link w:val="TitleChar"/>
-    <w:uiPriority w:val="10"/>
-    <w:qFormat/>
-    <w:rsid w:val="007F1CAC"/>
-    <w:pPr>
-      <w:spacing w:after="80" w:line="240" w:lineRule="auto"/>
-      <w:contextualSpacing/>
-    </w:pPr>
-    <w:rPr>
-      <w:rFonts w:asciiTheme="majorHAnsi" w:eastAsiaTheme="majorEastAsia" w:hAnsiTheme="majorHAnsi" w:cstheme="majorBidi"/>
-      <w:spacing w:val="-10"/>
-      <w:kern w:val="28"/>
-      <w:sz w:val="56"/>
-      <w:szCs w:val="56"/>
-    </w:rPr>
-  </w:style>
-  <w:style w:type="character" w:customStyle="1" w:styleId="TitleChar">
-    <w:name w:val="Title Char"/>
-    <w:basedOn w:val="DefaultParagraphFont"/>
-    <w:link w:val="Title"/>
-    <w:uiPriority w:val="10"/>
-    <w:rsid w:val="007F1CAC"/>
-    <w:rPr>
-      <w:rFonts w:asciiTheme="majorHAnsi" w:eastAsiaTheme="majorEastAsia" w:hAnsiTheme="majorHAnsi" w:cstheme="majorBidi"/>
-      <w:spacing w:val="-10"/>
-      <w:kern w:val="28"/>
-      <w:sz w:val="56"/>
-      <w:szCs w:val="56"/>
-    </w:rPr>
-  </w:style>
-  <w:style w:type="paragraph" w:styleId="Subtitle">
-    <w:name w:val="Subtitle"/>
-    <w:basedOn w:val="Normal"/>
-    <w:next w:val="Normal"/>
-    <w:link w:val="SubtitleChar"/>
-    <w:uiPriority w:val="11"/>
-    <w:qFormat/>
-    <w:rsid w:val="007F1CAC"/>
-    <w:pPr>
-      <w:numPr>
-        <w:ilvl w:val="1"/>
-      </w:numPr>
-    </w:pPr>
-    <w:rPr>
-      <w:rFonts w:eastAsiaTheme="majorEastAsia" w:cstheme="majorBidi"/>
-      <w:color w:val="595959" w:themeColor="text1" w:themeTint="A6"/>
-      <w:spacing w:val="15"/>
-      <w:sz w:val="28"/>
-      <w:szCs w:val="28"/>
-    </w:rPr>
-  </w:style>
-  <w:style w:type="character" w:customStyle="1" w:styleId="SubtitleChar">
-    <w:name w:val="Subtitle Char"/>
-    <w:basedOn w:val="DefaultParagraphFont"/>
-    <w:link w:val="Subtitle"/>
-    <w:uiPriority w:val="11"/>
-    <w:rsid w:val="007F1CAC"/>
-    <w:rPr>
-      <w:rFonts w:eastAsiaTheme="majorEastAsia" w:cstheme="majorBidi"/>
-      <w:color w:val="595959" w:themeColor="text1" w:themeTint="A6"/>
-      <w:spacing w:val="15"/>
-      <w:sz w:val="28"/>
-      <w:szCs w:val="28"/>
-    </w:rPr>
-  </w:style>
-  <w:style w:type="paragraph" w:styleId="Quote">
-    <w:name w:val="Quote"/>
-    <w:basedOn w:val="Normal"/>
-    <w:next w:val="Normal"/>
-    <w:link w:val="QuoteChar"/>
-    <w:uiPriority w:val="29"/>
-    <w:qFormat/>
-    <w:rsid w:val="007F1CAC"/>
-    <w:pPr>
-      <w:spacing w:before="160"/>
-      <w:jc w:val="center"/>
-    </w:pPr>
-    <w:rPr>
-      <w:i/>
-      <w:iCs/>
-      <w:color w:val="404040" w:themeColor="text1" w:themeTint="BF"/>
-    </w:rPr>
-  </w:style>
-  <w:style w:type="character" w:customStyle="1" w:styleId="QuoteChar">
-    <w:name w:val="Quote Char"/>
-    <w:basedOn w:val="DefaultParagraphFont"/>
-    <w:link w:val="Quote"/>
-    <w:uiPriority w:val="29"/>
-    <w:rsid w:val="007F1CAC"/>
-    <w:rPr>
-      <w:i/>
-      <w:iCs/>
-      <w:color w:val="404040" w:themeColor="text1" w:themeTint="BF"/>
-    </w:rPr>
-  </w:style>
-  <w:style w:type="paragraph" w:styleId="ListParagraph">
-    <w:name w:val="List Paragraph"/>
-    <w:basedOn w:val="Normal"/>
-    <w:uiPriority w:val="34"/>
-    <w:qFormat/>
-    <w:rsid w:val="007F1CAC"/>
-    <w:pPr>
-      <w:ind w:left="720"/>
-      <w:contextualSpacing/>
-    </w:pPr>
-  </w:style>
-  <w:style w:type="character" w:styleId="IntenseEmphasis">
-    <w:name w:val="Intense Emphasis"/>
-    <w:basedOn w:val="DefaultParagraphFont"/>
-    <w:uiPriority w:val="21"/>
-    <w:qFormat/>
-    <w:rsid w:val="007F1CAC"/>
-    <w:rPr>
-      <w:i/>
-      <w:iCs/>
-      <w:color w:val="0F4761" w:themeColor="accent1" w:themeShade="BF"/>
-    </w:rPr>
-  </w:style>
-  <w:style w:type="paragraph" w:styleId="IntenseQuote">
-    <w:name w:val="Intense Quote"/>
-    <w:basedOn w:val="Normal"/>
-    <w:next w:val="Normal"/>
-    <w:link w:val="IntenseQuoteChar"/>
-    <w:uiPriority w:val="30"/>
-    <w:qFormat/>
-    <w:rsid w:val="007F1CAC"/>
-    <w:pPr>
-      <w:pBdr>
-        <w:top w:val="single" w:sz="4" w:space="10" w:color="0F4761" w:themeColor="accent1" w:themeShade="BF"/>
-        <w:bottom w:val="single" w:sz="4" w:space="10" w:color="0F4761" w:themeColor="accent1" w:themeShade="BF"/>
-      </w:pBdr>
-      <w:spacing w:before="360" w:after="360"/>
-      <w:ind w:left="864" w:right="864"/>
-      <w:jc w:val="center"/>
-    </w:pPr>
-    <w:rPr>
-      <w:i/>
-      <w:iCs/>
-      <w:color w:val="0F4761" w:themeColor="accent1" w:themeShade="BF"/>
-    </w:rPr>
-  </w:style>
-  <w:style w:type="character" w:customStyle="1" w:styleId="IntenseQuoteChar">
-    <w:name w:val="Intense Quote Char"/>
-    <w:basedOn w:val="DefaultParagraphFont"/>
-    <w:link w:val="IntenseQuote"/>
-    <w:uiPriority w:val="30"/>
-    <w:rsid w:val="007F1CAC"/>
-    <w:rPr>
-      <w:i/>
-      <w:iCs/>
-      <w:color w:val="0F4761" w:themeColor="accent1" w:themeShade="BF"/>
-    </w:rPr>
-  </w:style>
-  <w:style w:type="character" w:styleId="IntenseReference">
-    <w:name w:val="Intense Reference"/>
-    <w:basedOn w:val="DefaultParagraphFont"/>
-    <w:uiPriority w:val="32"/>
-    <w:qFormat/>
-    <w:rsid w:val="007F1CAC"/>
-    <w:rPr>
-      <w:b/>
-      <w:bCs/>
-      <w:smallCaps/>
-      <w:color w:val="0F4761" w:themeColor="accent1" w:themeShade="BF"/>
-      <w:spacing w:val="5"/>
-    </w:rPr>
   </w:style>
 </w:styles>
 </file>

</xml_diff>